<commit_message>
Changed over to production API
</commit_message>
<xml_diff>
--- a/inst/extdata/ANSIS_HTTP_API.docx
+++ b/inst/extdata/ANSIS_HTTP_API.docx
@@ -1185,7 +1185,7 @@
                 <w:sz w:val="19"/>
                 <w:szCs w:val="19"/>
               </w:rPr>
-              <w:t>https://apim-ansis-hrm-test-ae.azure-api.net/site-catalogue/v1/catalogue-summary</w:t>
+              <w:t>https://apim-ansis-app-prod-ac.azure-api.net/site-catalogue/v1/catalogue-summary</w:t>
             </w:r>
           </w:p>
         </w:tc>
@@ -1735,25 +1735,22 @@
                 <w:szCs w:val="19"/>
               </w:rPr>
             </w:pPr>
-            <w:proofErr w:type="gramStart"/>
             <w:r>
               <w:rPr>
                 <w:rFonts w:ascii="Courier New" w:hAnsi="Courier New" w:cs="Courier New"/>
                 <w:sz w:val="19"/>
                 <w:szCs w:val="19"/>
               </w:rPr>
-              <w:t>https://apim-ansis-hrm-test-ae.azure-api.net/site-catalogue/v1/provider/</w:t>
+              <w:t>https://apim-ansis-app-prod-ac.azure-api.net/site-catalogue/v1/provider</w:t>
             </w:r>
             <w:r>
               <w:rPr>
                 <w:rFonts w:ascii="Courier New" w:hAnsi="Courier New" w:cs="Courier New"/>
-                <w:color w:val="FF0000"/>
                 <w:sz w:val="19"/>
                 <w:szCs w:val="19"/>
               </w:rPr>
-              <w:t>{</w:t>
-            </w:r>
-            <w:proofErr w:type="gramEnd"/>
+              <w:t>/{</w:t>
+            </w:r>
             <w:r>
               <w:rPr>
                 <w:rFonts w:ascii="Courier New" w:hAnsi="Courier New" w:cs="Courier New"/>
@@ -2945,7 +2942,7 @@
                 <w:sz w:val="19"/>
                 <w:szCs w:val="19"/>
               </w:rPr>
-              <w:t>https://apim-ansis-hrm-test-ae.azure-api.net/site-catalogue/v1/definitions</w:t>
+              <w:t>https://apim-ansis-app-prod-ac.azure-api.net/site-catalogue/v1/definitions</w:t>
             </w:r>
           </w:p>
         </w:tc>
@@ -3448,7 +3445,13 @@
     </w:p>
     <w:p>
       <w:r>
-        <w:t>Returns an access token required for all data requests to authenticate the user. Requires a password and username to be sent along with other fields in a form encoded body.</w:t>
+        <w:t xml:space="preserve">Returns an access token required for all data requests to authenticate the user. Requires a password and username to be sent </w:t>
+      </w:r>
+      <w:r>
+        <w:t>in the header</w:t>
+      </w:r>
+      <w:r>
+        <w:t>.</w:t>
       </w:r>
     </w:p>
     <w:p>
@@ -3516,13 +3519,12 @@
                 <w:sz w:val="19"/>
                 <w:szCs w:val="19"/>
               </w:rPr>
-              <w:t>https://b2cansishrmtestae.b2clogin.com/b2cansishrmtestae.onmicrosoft.com/B2C_1A_ROPC_AUTH/oauth2/v2.0/token?grant_type=password</w:t>
+              <w:t>https://apim-ansis-app-prod-ac.azure-api.net/ansis-external-api/query-requests/v2/Authorise</w:t>
             </w:r>
           </w:p>
         </w:tc>
       </w:tr>
     </w:tbl>
-    <w:p/>
     <w:p>
       <w:pPr>
         <w:rPr>
@@ -3530,230 +3532,26 @@
           <w:bCs/>
         </w:rPr>
       </w:pPr>
-      <w:r>
+    </w:p>
+    <w:p>
+      <w:pPr>
         <w:rPr>
           <w:b/>
           <w:bCs/>
         </w:rPr>
-        <w:t>Request Body Format:</w:t>
-      </w:r>
-    </w:p>
-    <w:tbl>
-      <w:tblPr>
-        <w:tblStyle w:val="TableGrid"/>
-        <w:tblW w:w="0" w:type="auto"/>
-        <w:tblLook w:val="04A0" w:firstRow="1" w:lastRow="0" w:firstColumn="1" w:lastColumn="0" w:noHBand="0" w:noVBand="1"/>
-      </w:tblPr>
-      <w:tblGrid>
-        <w:gridCol w:w="5228"/>
-        <w:gridCol w:w="5228"/>
-      </w:tblGrid>
-      <w:tr>
-        <w:tc>
-          <w:tcPr>
-            <w:tcW w:w="5228" w:type="dxa"/>
-          </w:tcPr>
-          <w:p>
-            <w:r>
-              <w:t>username</w:t>
-            </w:r>
-          </w:p>
-        </w:tc>
-        <w:tc>
-          <w:tcPr>
-            <w:tcW w:w="5228" w:type="dxa"/>
-          </w:tcPr>
-          <w:p>
-            <w:r>
-              <w:rPr>
-                <w:color w:val="FF0000"/>
-              </w:rPr>
-              <w:t>{</w:t>
-            </w:r>
-            <w:r>
-              <w:rPr>
-                <w:color w:val="FF0000"/>
-              </w:rPr>
-              <w:t>USERNAME</w:t>
-            </w:r>
-            <w:r>
-              <w:rPr>
-                <w:color w:val="FF0000"/>
-              </w:rPr>
-              <w:t>}</w:t>
-            </w:r>
-          </w:p>
-        </w:tc>
-      </w:tr>
-      <w:tr>
-        <w:tc>
-          <w:tcPr>
-            <w:tcW w:w="5228" w:type="dxa"/>
-          </w:tcPr>
-          <w:p>
-            <w:r>
-              <w:t>password</w:t>
-            </w:r>
-          </w:p>
-        </w:tc>
-        <w:tc>
-          <w:tcPr>
-            <w:tcW w:w="5228" w:type="dxa"/>
-          </w:tcPr>
-          <w:p>
-            <w:r>
-              <w:rPr>
-                <w:color w:val="FF0000"/>
-              </w:rPr>
-              <w:t>{</w:t>
-            </w:r>
-            <w:r>
-              <w:rPr>
-                <w:color w:val="FF0000"/>
-              </w:rPr>
-              <w:t>PASSWORD</w:t>
-            </w:r>
-            <w:r>
-              <w:rPr>
-                <w:color w:val="FF0000"/>
-              </w:rPr>
-              <w:t>}</w:t>
-            </w:r>
-          </w:p>
-        </w:tc>
-      </w:tr>
-      <w:tr>
-        <w:tc>
-          <w:tcPr>
-            <w:tcW w:w="5228" w:type="dxa"/>
-          </w:tcPr>
-          <w:p>
-            <w:proofErr w:type="spellStart"/>
-            <w:r>
-              <w:t>grant_type</w:t>
-            </w:r>
-            <w:proofErr w:type="spellEnd"/>
-          </w:p>
-        </w:tc>
-        <w:tc>
-          <w:tcPr>
-            <w:tcW w:w="5228" w:type="dxa"/>
-          </w:tcPr>
-          <w:p>
-            <w:r>
-              <w:t>password</w:t>
-            </w:r>
-          </w:p>
-        </w:tc>
-      </w:tr>
-      <w:tr>
-        <w:tc>
-          <w:tcPr>
-            <w:tcW w:w="5228" w:type="dxa"/>
-          </w:tcPr>
-          <w:p>
-            <w:r>
-              <w:t>scope</w:t>
-            </w:r>
-          </w:p>
-        </w:tc>
-        <w:tc>
-          <w:tcPr>
-            <w:tcW w:w="5228" w:type="dxa"/>
-          </w:tcPr>
-          <w:p>
-            <w:proofErr w:type="spellStart"/>
-            <w:r>
-              <w:t>openid</w:t>
-            </w:r>
-            <w:proofErr w:type="spellEnd"/>
-            <w:r>
-              <w:t xml:space="preserve"> 44040d13-769e-4567-8bbe-b2109b42c939</w:t>
-            </w:r>
-          </w:p>
-        </w:tc>
-      </w:tr>
-      <w:tr>
-        <w:tc>
-          <w:tcPr>
-            <w:tcW w:w="5228" w:type="dxa"/>
-          </w:tcPr>
-          <w:p>
-            <w:proofErr w:type="spellStart"/>
-            <w:r>
-              <w:t>client_id</w:t>
-            </w:r>
-            <w:proofErr w:type="spellEnd"/>
-          </w:p>
-        </w:tc>
-        <w:tc>
-          <w:tcPr>
-            <w:tcW w:w="5228" w:type="dxa"/>
-          </w:tcPr>
-          <w:p>
-            <w:r>
-              <w:t>44040d13-769e-4567-8bbe-b2109b42c939</w:t>
-            </w:r>
-          </w:p>
-        </w:tc>
-      </w:tr>
-      <w:tr>
-        <w:tc>
-          <w:tcPr>
-            <w:tcW w:w="5228" w:type="dxa"/>
-          </w:tcPr>
-          <w:p>
-            <w:proofErr w:type="spellStart"/>
-            <w:r>
-              <w:t>response_id</w:t>
-            </w:r>
-            <w:proofErr w:type="spellEnd"/>
-          </w:p>
-        </w:tc>
-        <w:tc>
-          <w:tcPr>
-            <w:tcW w:w="5228" w:type="dxa"/>
-          </w:tcPr>
-          <w:p>
-            <w:r>
-              <w:t xml:space="preserve">token </w:t>
-            </w:r>
-            <w:proofErr w:type="spellStart"/>
-            <w:r>
-              <w:t>id_token</w:t>
-            </w:r>
-            <w:proofErr w:type="spellEnd"/>
-          </w:p>
-        </w:tc>
-      </w:tr>
-    </w:tbl>
-    <w:p>
-      <w:pPr>
+      </w:pPr>
+      <w:r>
         <w:rPr>
           <w:b/>
           <w:bCs/>
         </w:rPr>
-      </w:pPr>
-    </w:p>
-    <w:p>
-      <w:pPr>
+        <w:t>Response Body Format</w:t>
+      </w:r>
+      <w:r>
         <w:rPr>
           <w:b/>
           <w:bCs/>
         </w:rPr>
-      </w:pPr>
-      <w:r>
-        <w:rPr>
-          <w:b/>
-          <w:bCs/>
-        </w:rPr>
-        <w:t>Response Body Format</w:t>
-      </w:r>
-      <w:r>
-        <w:rPr>
-          <w:b/>
-          <w:bCs/>
-        </w:rPr>
         <w:t>:</w:t>
       </w:r>
     </w:p>
@@ -3811,31 +3609,17 @@
         <w:t>    "</w:t>
       </w:r>
       <w:proofErr w:type="spellStart"/>
-      <w:proofErr w:type="gramStart"/>
-      <w:r>
-        <w:rPr>
-          <w:rFonts w:ascii="Courier New" w:eastAsia="Times New Roman" w:hAnsi="Courier New" w:cs="Courier New"/>
-          <w:color w:val="DCDCDC"/>
-          <w:kern w:val="0"/>
-          <w:sz w:val="18"/>
-          <w:szCs w:val="18"/>
-          <w:lang w:eastAsia="en-AU"/>
-          <w14:ligatures w14:val="none"/>
-        </w:rPr>
-        <w:t>access</w:t>
-      </w:r>
-      <w:proofErr w:type="gramEnd"/>
-      <w:r>
-        <w:rPr>
-          <w:rFonts w:ascii="Courier New" w:eastAsia="Times New Roman" w:hAnsi="Courier New" w:cs="Courier New"/>
-          <w:color w:val="DCDCDC"/>
-          <w:kern w:val="0"/>
-          <w:sz w:val="18"/>
-          <w:szCs w:val="18"/>
-          <w:lang w:eastAsia="en-AU"/>
-          <w14:ligatures w14:val="none"/>
-        </w:rPr>
-        <w:t>_token</w:t>
+      <w:r>
+        <w:rPr>
+          <w:rFonts w:ascii="Courier New" w:eastAsia="Times New Roman" w:hAnsi="Courier New" w:cs="Courier New"/>
+          <w:color w:val="DCDCDC"/>
+          <w:kern w:val="0"/>
+          <w:sz w:val="18"/>
+          <w:szCs w:val="18"/>
+          <w:lang w:eastAsia="en-AU"/>
+          <w14:ligatures w14:val="none"/>
+        </w:rPr>
+        <w:t>access_token</w:t>
       </w:r>
       <w:proofErr w:type="spellEnd"/>
       <w:r>
@@ -3902,31 +3686,17 @@
         <w:t>    "</w:t>
       </w:r>
       <w:proofErr w:type="spellStart"/>
-      <w:proofErr w:type="gramStart"/>
-      <w:r>
-        <w:rPr>
-          <w:rFonts w:ascii="Courier New" w:eastAsia="Times New Roman" w:hAnsi="Courier New" w:cs="Courier New"/>
-          <w:color w:val="DCDCDC"/>
-          <w:kern w:val="0"/>
-          <w:sz w:val="18"/>
-          <w:szCs w:val="18"/>
-          <w:lang w:eastAsia="en-AU"/>
-          <w14:ligatures w14:val="none"/>
-        </w:rPr>
-        <w:t>token</w:t>
-      </w:r>
-      <w:proofErr w:type="gramEnd"/>
-      <w:r>
-        <w:rPr>
-          <w:rFonts w:ascii="Courier New" w:eastAsia="Times New Roman" w:hAnsi="Courier New" w:cs="Courier New"/>
-          <w:color w:val="DCDCDC"/>
-          <w:kern w:val="0"/>
-          <w:sz w:val="18"/>
-          <w:szCs w:val="18"/>
-          <w:lang w:eastAsia="en-AU"/>
-          <w14:ligatures w14:val="none"/>
-        </w:rPr>
-        <w:t>_type</w:t>
+      <w:r>
+        <w:rPr>
+          <w:rFonts w:ascii="Courier New" w:eastAsia="Times New Roman" w:hAnsi="Courier New" w:cs="Courier New"/>
+          <w:color w:val="DCDCDC"/>
+          <w:kern w:val="0"/>
+          <w:sz w:val="18"/>
+          <w:szCs w:val="18"/>
+          <w:lang w:eastAsia="en-AU"/>
+          <w14:ligatures w14:val="none"/>
+        </w:rPr>
+        <w:t>token_type</w:t>
       </w:r>
       <w:proofErr w:type="spellEnd"/>
       <w:r>
@@ -3969,31 +3739,17 @@
         <w:t>    "</w:t>
       </w:r>
       <w:proofErr w:type="spellStart"/>
-      <w:proofErr w:type="gramStart"/>
-      <w:r>
-        <w:rPr>
-          <w:rFonts w:ascii="Courier New" w:eastAsia="Times New Roman" w:hAnsi="Courier New" w:cs="Courier New"/>
-          <w:color w:val="DCDCDC"/>
-          <w:kern w:val="0"/>
-          <w:sz w:val="18"/>
-          <w:szCs w:val="18"/>
-          <w:lang w:eastAsia="en-AU"/>
-          <w14:ligatures w14:val="none"/>
-        </w:rPr>
-        <w:t>expires</w:t>
-      </w:r>
-      <w:proofErr w:type="gramEnd"/>
-      <w:r>
-        <w:rPr>
-          <w:rFonts w:ascii="Courier New" w:eastAsia="Times New Roman" w:hAnsi="Courier New" w:cs="Courier New"/>
-          <w:color w:val="DCDCDC"/>
-          <w:kern w:val="0"/>
-          <w:sz w:val="18"/>
-          <w:szCs w:val="18"/>
-          <w:lang w:eastAsia="en-AU"/>
-          <w14:ligatures w14:val="none"/>
-        </w:rPr>
-        <w:t>_in</w:t>
+      <w:r>
+        <w:rPr>
+          <w:rFonts w:ascii="Courier New" w:eastAsia="Times New Roman" w:hAnsi="Courier New" w:cs="Courier New"/>
+          <w:color w:val="DCDCDC"/>
+          <w:kern w:val="0"/>
+          <w:sz w:val="18"/>
+          <w:szCs w:val="18"/>
+          <w:lang w:eastAsia="en-AU"/>
+          <w14:ligatures w14:val="none"/>
+        </w:rPr>
+        <w:t>expires_in</w:t>
       </w:r>
       <w:proofErr w:type="spellEnd"/>
       <w:r>
@@ -4036,31 +3792,17 @@
         <w:t>    "</w:t>
       </w:r>
       <w:proofErr w:type="spellStart"/>
-      <w:proofErr w:type="gramStart"/>
-      <w:r>
-        <w:rPr>
-          <w:rFonts w:ascii="Courier New" w:eastAsia="Times New Roman" w:hAnsi="Courier New" w:cs="Courier New"/>
-          <w:color w:val="DCDCDC"/>
-          <w:kern w:val="0"/>
-          <w:sz w:val="18"/>
-          <w:szCs w:val="18"/>
-          <w:lang w:eastAsia="en-AU"/>
-          <w14:ligatures w14:val="none"/>
-        </w:rPr>
-        <w:t>id</w:t>
-      </w:r>
-      <w:proofErr w:type="gramEnd"/>
-      <w:r>
-        <w:rPr>
-          <w:rFonts w:ascii="Courier New" w:eastAsia="Times New Roman" w:hAnsi="Courier New" w:cs="Courier New"/>
-          <w:color w:val="DCDCDC"/>
-          <w:kern w:val="0"/>
-          <w:sz w:val="18"/>
-          <w:szCs w:val="18"/>
-          <w:lang w:eastAsia="en-AU"/>
-          <w14:ligatures w14:val="none"/>
-        </w:rPr>
-        <w:t>_token</w:t>
+      <w:r>
+        <w:rPr>
+          <w:rFonts w:ascii="Courier New" w:eastAsia="Times New Roman" w:hAnsi="Courier New" w:cs="Courier New"/>
+          <w:color w:val="DCDCDC"/>
+          <w:kern w:val="0"/>
+          <w:sz w:val="18"/>
+          <w:szCs w:val="18"/>
+          <w:lang w:eastAsia="en-AU"/>
+          <w14:ligatures w14:val="none"/>
+        </w:rPr>
+        <w:t>id_token</w:t>
       </w:r>
       <w:proofErr w:type="spellEnd"/>
       <w:r>
@@ -4294,16 +4036,15 @@
                 <w:sz w:val="19"/>
                 <w:szCs w:val="19"/>
               </w:rPr>
-              <w:t>https://apim-ansis-hrm-test-ae.azure-api.net/sdr-public/v1/SingleSite?provider</w:t>
-            </w:r>
-            <w:proofErr w:type="gramStart"/>
+              <w:t>https://apim-ansis-app-prod-ac.azure-api.net/sdr-public/v1/SingleSite</w:t>
+            </w:r>
             <w:r>
               <w:rPr>
                 <w:rFonts w:ascii="Courier New" w:hAnsi="Courier New" w:cs="Courier New"/>
                 <w:sz w:val="19"/>
                 <w:szCs w:val="19"/>
               </w:rPr>
-              <w:t>=</w:t>
+              <w:t>?provider=</w:t>
             </w:r>
             <w:r>
               <w:rPr>
@@ -4312,9 +4053,16 @@
                 <w:sz w:val="19"/>
                 <w:szCs w:val="19"/>
               </w:rPr>
-              <w:t>{</w:t>
-            </w:r>
-            <w:proofErr w:type="gramEnd"/>
+              <w:t>{PROVIDER ID}</w:t>
+            </w:r>
+            <w:r>
+              <w:rPr>
+                <w:rFonts w:ascii="Courier New" w:hAnsi="Courier New" w:cs="Courier New"/>
+                <w:sz w:val="19"/>
+                <w:szCs w:val="19"/>
+              </w:rPr>
+              <w:t>&amp;site=</w:t>
+            </w:r>
             <w:r>
               <w:rPr>
                 <w:rFonts w:ascii="Courier New" w:hAnsi="Courier New" w:cs="Courier New"/>
@@ -4322,62 +4070,7 @@
                 <w:sz w:val="19"/>
                 <w:szCs w:val="19"/>
               </w:rPr>
-              <w:t xml:space="preserve">PROVIDER </w:t>
-            </w:r>
-            <w:proofErr w:type="gramStart"/>
-            <w:r>
-              <w:rPr>
-                <w:rFonts w:ascii="Courier New" w:hAnsi="Courier New" w:cs="Courier New"/>
-                <w:color w:val="FF0000"/>
-                <w:sz w:val="19"/>
-                <w:szCs w:val="19"/>
-              </w:rPr>
-              <w:t>ID}</w:t>
-            </w:r>
-            <w:r>
-              <w:rPr>
-                <w:rFonts w:ascii="Courier New" w:hAnsi="Courier New" w:cs="Courier New"/>
-                <w:sz w:val="19"/>
-                <w:szCs w:val="19"/>
-              </w:rPr>
-              <w:t>&amp;</w:t>
-            </w:r>
-            <w:proofErr w:type="gramEnd"/>
-            <w:r>
-              <w:rPr>
-                <w:rFonts w:ascii="Courier New" w:hAnsi="Courier New" w:cs="Courier New"/>
-                <w:sz w:val="19"/>
-                <w:szCs w:val="19"/>
-              </w:rPr>
-              <w:t>site</w:t>
-            </w:r>
-            <w:proofErr w:type="gramStart"/>
-            <w:r>
-              <w:rPr>
-                <w:rFonts w:ascii="Courier New" w:hAnsi="Courier New" w:cs="Courier New"/>
-                <w:sz w:val="19"/>
-                <w:szCs w:val="19"/>
-              </w:rPr>
-              <w:t>=</w:t>
-            </w:r>
-            <w:r>
-              <w:rPr>
-                <w:rFonts w:ascii="Courier New" w:hAnsi="Courier New" w:cs="Courier New"/>
-                <w:color w:val="FF0000"/>
-                <w:sz w:val="19"/>
-                <w:szCs w:val="19"/>
-              </w:rPr>
-              <w:t>{</w:t>
-            </w:r>
-            <w:proofErr w:type="gramEnd"/>
-            <w:r>
-              <w:rPr>
-                <w:rFonts w:ascii="Courier New" w:hAnsi="Courier New" w:cs="Courier New"/>
-                <w:color w:val="FF0000"/>
-                <w:sz w:val="19"/>
-                <w:szCs w:val="19"/>
-              </w:rPr>
-              <w:t>SITE ID}</w:t>
+              <w:t>{SITE ID}</w:t>
             </w:r>
           </w:p>
         </w:tc>
@@ -4537,7 +4230,7 @@
                 <w:sz w:val="19"/>
                 <w:szCs w:val="19"/>
               </w:rPr>
-              <w:t>https://apim-ansis-hrm-test-ae.azure-api.net/ansis-external-api/query-requests/v2/create-query-request</w:t>
+              <w:t>https://apim-ansis-app-prod-ac.azure-api.net/ansis-external-api/query-requests/v2/create-query-request</w:t>
             </w:r>
           </w:p>
         </w:tc>
@@ -6305,7 +5998,7 @@
                 <w:sz w:val="19"/>
                 <w:szCs w:val="19"/>
               </w:rPr>
-              <w:t>https://apim-ansis-hrm-test-ae.azure-api.net/ansis-external-api/query-requests/v2/get-query-request-status?requestId=</w:t>
+              <w:t>https://apim-ansis-app-prod-ac.azure-api.net/ansis-external-api/query-requests/v2/get-query-request-status</w:t>
             </w:r>
             <w:r>
               <w:rPr>
@@ -6314,7 +6007,7 @@
                 <w:sz w:val="19"/>
                 <w:szCs w:val="19"/>
               </w:rPr>
-              <w:t>{REQUEST_ID}</w:t>
+              <w:t>REQUEST_ID}</w:t>
             </w:r>
           </w:p>
         </w:tc>
@@ -7400,7 +7093,7 @@
                 <w:sz w:val="19"/>
                 <w:szCs w:val="19"/>
               </w:rPr>
-              <w:t>https://apim-ansis-hrm-test-ae.azure-api.net/ansis-external-api/query-requests/v2/get-all-query-requests-statuses</w:t>
+              <w:t>https://apim-ansis-app-prod-ac.azure-api.net/ansis-external-api/query-requests/v2/get-all-query-requests-statuses</w:t>
             </w:r>
           </w:p>
         </w:tc>
@@ -7562,16 +7255,7 @@
                 <w:sz w:val="19"/>
                 <w:szCs w:val="19"/>
               </w:rPr>
-              <w:t>https://apim-ansis-hrm-test-ae.azure-api.net/ansis-external-api/query-requests/v2/download-response?fileId</w:t>
-            </w:r>
-            <w:proofErr w:type="gramStart"/>
-            <w:r>
-              <w:rPr>
-                <w:rFonts w:ascii="Courier New" w:hAnsi="Courier New" w:cs="Courier New"/>
-                <w:sz w:val="19"/>
-                <w:szCs w:val="19"/>
-              </w:rPr>
-              <w:t>=</w:t>
+              <w:t>https://apim-ansis-hrm-test-ae.azure-api.net/ansis-external-api/query-requests/v2/download-response?fileId=</w:t>
             </w:r>
             <w:r>
               <w:rPr>
@@ -7580,17 +7264,7 @@
                 <w:sz w:val="19"/>
                 <w:szCs w:val="19"/>
               </w:rPr>
-              <w:t>{</w:t>
-            </w:r>
-            <w:proofErr w:type="gramEnd"/>
-            <w:r>
-              <w:rPr>
-                <w:rFonts w:ascii="Courier New" w:hAnsi="Courier New" w:cs="Courier New"/>
-                <w:color w:val="FF0000"/>
-                <w:sz w:val="19"/>
-                <w:szCs w:val="19"/>
-              </w:rPr>
-              <w:t>FILE ID}</w:t>
+              <w:t>{FILE ID}</w:t>
             </w:r>
           </w:p>
         </w:tc>
@@ -7754,16 +7428,7 @@
                 <w:sz w:val="19"/>
                 <w:szCs w:val="19"/>
               </w:rPr>
-              <w:t>https://apim-ansis-hrm-test-ae.azure-api.net/ansis-external-api/query-requests/v2/cancel-query-request?requestId</w:t>
-            </w:r>
-            <w:proofErr w:type="gramStart"/>
-            <w:r>
-              <w:rPr>
-                <w:rFonts w:ascii="Courier New" w:hAnsi="Courier New" w:cs="Courier New"/>
-                <w:sz w:val="19"/>
-                <w:szCs w:val="19"/>
-              </w:rPr>
-              <w:t>=</w:t>
+              <w:t>https://apim-ansis-hrm-test-ae.azure-api.net/ansis-external-api/query-requests/v2/cancel-query-request?requestId=</w:t>
             </w:r>
             <w:r>
               <w:rPr>
@@ -7772,17 +7437,7 @@
                 <w:sz w:val="19"/>
                 <w:szCs w:val="19"/>
               </w:rPr>
-              <w:t>{</w:t>
-            </w:r>
-            <w:proofErr w:type="gramEnd"/>
-            <w:r>
-              <w:rPr>
-                <w:rFonts w:ascii="Courier New" w:hAnsi="Courier New" w:cs="Courier New"/>
-                <w:color w:val="FF0000"/>
-                <w:sz w:val="19"/>
-                <w:szCs w:val="19"/>
-              </w:rPr>
-              <w:t>REQUEST ID}</w:t>
+              <w:t>{REQUEST ID}</w:t>
             </w:r>
           </w:p>
         </w:tc>

</xml_diff>